<commit_message>
versions: round-2 snapshot (88/93 submission-ready) + compact docx rebuild with updated draft + anchor fix
</commit_message>
<xml_diff>
--- a/workshop1/compact3_figs.docx
+++ b/workshop1/compact3_figs.docx
@@ -75,7 +75,7 @@
           <w:b w:val="0"/>
           <w:i/>
         </w:rPr>
-        <w:t xml:space="preserve"> at all seven tested N, to seven decimals. Per-sample agreement equals that modal frequency — 56–86% by cell — while a round-number baseline hits 2 of 69 valid samples. We preregistered these point predictions and tested them out of sample on two new containers (square and rectangle), restating but never refitting the rule. Across three nominal tiers we find an inversion: constructive ambition rises with tier while execution validity does not (78% → 100% → 13% at the primary 10⁻⁶ tolerance; the top-tier arm ran through an unattributable serving alias, opus_alias, flagged throughout). Requesting a method-naming trace line concentrates output onto the anchor (87% vs 70% on-prediction, p = 0.03 uncorrected — failing Holm over the registered family) with no detectable validity change. Our contribution relative to a growing diversity-collapse literature is not that collapse occurs — it is the expected default — but that its mode is predictable in closed form </w:t>
+        <w:t xml:space="preserve"> at all seven tested N, to seven decimals. Per-sample agreement equals that modal frequency — 56–86% by cell — while a round-number baseline hits 2 of 69 valid samples. We preregistered these point predictions and tested them out of sample on two new containers (square and rectangle), restating but never refitting the rule; rectangle support is partial — 5 of 11 valid samples on-prediction, not separable from a uniform-template null, though 0 of 11 reached the provably higher-scoring rival. Across three nominal tiers we find an inversion: constructive ambition rises monotonically with tier while execution validity rises then collapses (78% → 100% → 13% at the primary 10⁻⁶ tolerance; the top-tier arm ran through an unattributable serving alias, opus_alias, flagged throughout). Requesting a method-naming trace line concentrates output onto the anchor (87% vs 70% on-prediction, p = 0.03 uncorrected — failing Holm over the registered family, carried by one of three cells and confounded with a collection-wave split of comparable size) with no detectable validity change. Our contribution relative to a growing diversity-collapse literature is not that collapse occurs — it is the expected default — but that its mode is predictable in closed form </w:t>
       </w:r>
       <w:r>
         <w:rPr>
@@ -170,7 +170,7 @@
         <w:rPr>
           <w:b w:val="0"/>
         </w:rPr>
-        <w:t>², not primality. "Trap" names the branch, not a guaranteed value loss: at N = 35 (and every N = k² − 1 with k ≥ 6) truncation is value-optimal within the family; the cells where value is genuinely left on the table are N = 13, 21, 31, 43, with gaps 0.15–0.17. Every value is checked against an independent LP oracle (83 configurations, both branches, drift below 10⁻⁹).</w:t>
+        <w:t>², not primality. "Trap" names the branch, not a guaranteed value loss: at N = 35 (and every N = k² − 1 with k ≥ 6) truncation is value-optimal within the family; the largest losses are at N = 13, 21, 31, 43 (gaps 0.15–0.17), with a small residual at N = 24 (0.014, i.e. 0.59%). Trap and converge zones both contain primes (trap: 13, 23, 31, 43, 47, 59; converge: 11, 17, 19, 29, 37, 41, 53), which is what rules primality out as the driver. Every value is checked against an independent LP oracle (83 configurations, both branches, drift below 10⁻⁹).</w:t>
       </w:r>
     </w:p>
     <w:p>
@@ -852,7 +852,39 @@
         <w:rPr>
           <w:b w:val="0"/>
         </w:rPr>
-        <w:t>No predictor of a single value can exceed the modal frequency, and this one attains it at all 7 cells: the residual is dispersion, not misprediction. The prediction itself is categorical — which template, and hence its computed value; the seven-decimal match verifies the identification rather than adding evidential strength. Two baselines: a naive "round number" null hits 2 of the same 69 valid samples, and the stronger null we use for the rectangle — a proposer uniform over a few plausible template shapes, roughly one third on-prediction — is cleared by each of the three powered cells (56%, 80%, 76% at n ≥ 15 valid). The four cells with n ≤ 7 valid are individually underpowered (Wilson 95% CI on 3/4 spans roughly [30%, 95%]) and count as replications of the pattern, not independent confirmations. Pooled across every tier and container the on-prediction rate is 46% — higher tiers are almost never on-prediction, so the closed form is a weak-tier law.</w:t>
+      </w:r>
+      <w:r>
+        <w:rPr>
+          <w:b w:val="0"/>
+          <w:i/>
+        </w:rPr>
+        <w:t>Figure 1 (repository asset workshop1/figs/fig1.png) plots the prediction against the best-in-family value across all seven cells, with the four gap segments marked; Figure 2 (fig2.png) shows the tier ladder of §3.</w:t>
+      </w:r>
+      <w:r>
+        <w:rPr>
+          <w:b w:val="0"/>
+        </w:rPr>
+      </w:r>
+    </w:p>
+    <w:p>
+      <w:r>
+        <w:rPr>
+          <w:b w:val="0"/>
+        </w:rPr>
+        <w:t>No predictor of a single value can exceed the modal frequency, and this one attains it at all 7 cells: the residual is dispersion, not misprediction. A post-hoc structural check (disclosed as such; diagnostics_kmatch.py) backs the grid order out of each sample's dominant radius: all 50 of 50 on-prediction samples are k</w:t>
+      </w:r>
+      <w:r>
+        <w:rPr>
+          <w:b w:val="0"/>
+          <w:i/>
+        </w:rPr>
+        <w:t>-structured, and 64 of 69 valid samples overall (93%) sit on the k</w:t>
+      </w:r>
+      <w:r>
+        <w:rPr>
+          <w:b w:val="0"/>
+        </w:rPr>
+        <w:t xml:space="preserve"> grid — most value misses are k*-grid variants, not different constructions. The prediction itself is categorical — which template, and hence its computed value; the seven-decimal match verifies the identification rather than adding evidential strength. Two baselines: a naive "round number" null hits 2 of the same 69 valid samples, and the stronger null we use for the rectangle — a proposer uniform over a few plausible template shapes, roughly one third on-prediction — is cleared by each of the three powered cells (56%, 80%, 76% at n ≥ 15 valid). The four cells with n ≤ 7 valid are individually underpowered (Wilson 95% CI on 3/4 spans roughly [30%, 95%]) and count as replications of the pattern, not independent confirmations. Pooled across every tier and container the on-prediction rate is 46% (47/102 valid samples) — higher tiers are almost never on-prediction, so the closed form is a weak-tier regularity (single-vendor so far, §5).</w:t>
       </w:r>
     </w:p>
     <w:p>
@@ -922,20 +954,20 @@
         <w:rPr>
           <w:b w:val="0"/>
         </w:rPr>
-        <w:t xml:space="preserve"> For a 1×a rectangle the template gains an aspect-corrected pair of parameters (q</w:t>
+        <w:t xml:space="preserve"> For a 1×a rectangle the template gains an aspect-corrected pair of parameters — q</w:t>
       </w:r>
       <w:r>
         <w:rPr>
           <w:b w:val="0"/>
           <w:i/>
         </w:rPr>
-        <w:t>, p</w:t>
+        <w:t xml:space="preserve"> = round(√(N/a)) rows of p</w:t>
       </w:r>
       <w:r>
         <w:rPr>
           <w:b w:val="0"/>
         </w:rPr>
-        <w:t xml:space="preserve">, collapsing to round(√N) at a = 1), restated but never refitted. Probing two sharpest cells in a container none had seen before (N = 19 at a = 3; N = 25 at a = 2), </w:t>
+        <w:t xml:space="preserve"> = round(√(N·a)) columns, collapsing to round(√N) at a = 1 — restated but never refitted. Probing two sharpest cells in a container none had seen before (N = 19 at a = 3; N = 25 at a = 2), </w:t>
       </w:r>
       <w:r>
         <w:rPr>
@@ -963,7 +995,7 @@
         <w:rPr>
           <w:b w:val="0"/>
         </w:rPr>
-        <w:t>Holding prompt, container, and scoring fixed, we varied only the nominal proposer tier at the three hardest-discriminating cells (N = 13, 21, 31). The weak tier truncates uniform grids: 35 of 45 invocations valid at 10⁻⁶ (78%), 29 of 45 at 10⁻⁹ (64%). A middle tier (Sonnet-class) perturbs and mixes templates — enlarged edge rows, hexagonal interior rows, multi-radius packings — valid 30/30 at 10⁻⁶ (100%), 27/30 (90%) at 10⁻⁹, but almost never on-prediction. A third arm, addressed only through a bare serving alias with no attestable weights binding (opus_alias, flagged with that caveat throughout and never referred to as any specific dated model), attempts recursive gasket-style constructions and is valid in 4 of 30 invocations (13%) at both tolerances, failing mostly on geometric overlap rather than numerical error. A post-hoc diagnostic (not preregistered; labeled as such in the repository) rules out a tolerance artifact behind that 13%: 24 of 26 invalid samples overlap grossly (median maximum overlap 3.3×10⁻²; radius-shrink repair costs a median 15% of sum-of-radii), while tolerance-scale near-misses (&lt; 2.5×10⁻⁵) occur instead in 5 of 7 geometry-scored weak-tier failures — the exact-tangency grids, not the ambitious constructions. The ladder: 78% → 100% → 13% (64% → 90% → 13% at the stricter tolerance). "Monotone" applies to ambition only, while validity rises then collapses — a boundary condition on the main result: the branch rule is a weak-tier law, holding at the tier furthest from what discovery-loop proposers typically use.</w:t>
+        <w:t>Holding prompt, container, and scoring fixed, we varied only the nominal proposer tier at the three hardest-discriminating cells (N = 13, 21, 31). The weak tier truncates uniform grids: 35 of 45 invocations valid at 10⁻⁶ (78%), 29 of 45 at 10⁻⁹ (64%). A middle tier (Sonnet-class) perturbs and mixes templates — enlarged edge rows, hexagonal interior rows, multi-radius packings — valid 30/30 at 10⁻⁶ (100%), 27/30 (90%) at 10⁻⁹, but almost never on-prediction. A third arm, addressed only through a bare serving alias with no attestable weights binding (opus_alias, flagged with that caveat throughout and never referred to as any specific dated model), attempts recursive gasket-style constructions and is valid in 4 of 30 invocations (13%) at both tolerances, failing mostly on geometric overlap rather than numerical error. A post-hoc diagnostic (not preregistered; labeled as such in the repository) finds no evidence of a tolerance artifact behind that 13% in this sample: 24 of 26 invalid samples overlap grossly (median maximum overlap 3.3×10⁻²; radius-shrink repair costs a median 15% of sum-of-radii), while tolerance-scale near-misses (&lt; 2.5×10⁻⁵) occur instead in 5 of 7 geometry-scored weak-tier failures — the exact-tangency grids, not the ambitious constructions. The ladder: 78% → 100% → 13% (64% → 90% → 13% at the stricter tolerance). "Monotone" applies to ambition only, while validity rises then collapses — a boundary condition on the main result: the branch rule is a weak-tier regularity, holding at the tier furthest from what discovery-loop proposers typically use.</w:t>
       </w:r>
     </w:p>
     <w:p>
@@ -1030,7 +1062,7 @@
         <w:rPr>
           <w:b w:val="0"/>
         </w:rPr>
-        <w:t xml:space="preserve">A preregistered scaled arm (100 new invocations) compared a bare prompt against a near-minimal variant requesting a leading METHOD: line. Validity showed no detectable change (53/60 trace vs 50/60 bare, p = 0.30, a failure to detect rather than evidence of no effect). Anchor concentration met its registered directional criterion — </w:t>
+        <w:t xml:space="preserve">A preregistered scaled arm (100 new invocations: 40 bare + 60 trace; 20 of the 60 analyzed bare rows are pre-existing arm-F samples, disclosed in the preregistration) compared a bare prompt against a near-minimal variant requesting a leading METHOD: line — itself a bundled prompt-format-and-trace-request intervention. Validity showed no detectable change (53/60 trace vs 50/60 bare, p = 0.30, a failure to detect rather than evidence of no effect). Anchor concentration met its registered directional criterion — </w:t>
       </w:r>
       <w:r>
         <w:rPr>
@@ -1042,7 +1074,7 @@
         <w:rPr>
           <w:b w:val="0"/>
         </w:rPr>
-        <w:t xml:space="preserve"> — but this is inferentially fragile: the p-value (p = 0.0325, one-sided, uncorrected) fails the Holm threshold (0.0167) over the registered family of three tested predictions, and the pooled gap is driven almost entirely by one of three cells (N = 13); a post hoc comparison further shows the bare arm's own between-wave drift is comparable in size to the effect attributed to the manipulation. We report this finding as </w:t>
+        <w:t xml:space="preserve"> — but this is inferentially fragile: the p-value (p = 0.0325, one-sided, uncorrected) fails the Holm threshold (0.0167) over the registered family of three tested predictions, and the pooled gap is driven almost entirely by one of three cells (N = 13); a post hoc comparison further shows the bare arm's own between-wave drift is comparable in size to the effect attributed to the manipulation. A second registered outcome, rival-value suppression, was also met as registered (1 of 53 valid trace samples hit the rival vs 2 of 50 bare; directional, no inferential weight claimed). We report both findings as </w:t>
       </w:r>
       <w:r>
         <w:rPr>
@@ -1055,7 +1087,7 @@
         <w:rPr>
           <w:b w:val="0"/>
         </w:rPr>
-        <w:t>, never as a confirmed or demonstrated effect. Method lines are independently checkable against emitted coordinates: a blind hand-adjudication finds 54 of 56 scoreable claims (96.4%) describe the object actually built, Wilson 95% CI [88%, 99%].</w:t>
+        <w:t>, never as confirmed or demonstrated effects. Method lines are independently checkable against emitted coordinates: a blind hand-adjudication finds 54 of 56 scoreable claims (96.4%) describe the object actually built, Wilson 95% CI [88%, 99%].</w:t>
       </w:r>
     </w:p>
     <w:p>

</xml_diff>

<commit_message>
snapshot versions/2026-08-04_armM at 90/100 submission-ready; rebuild compact docx
Co-Authored-By: Claude Fable 5 <noreply@anthropic.com>
</commit_message>
<xml_diff>
--- a/workshop1/compact3_figs.docx
+++ b/workshop1/compact3_figs.docx
@@ -75,13 +75,26 @@
           <w:b w:val="0"/>
           <w:i/>
         </w:rPr>
-        <w:t xml:space="preserve"> at all seven tested N, to seven decimals. Per-sample agreement equals that modal frequency — 56–86% by cell — while a round-number baseline hits 2 of 69 valid samples. We preregistered these point predictions and tested them out of sample on two new containers (square and rectangle), restating but never refitting the rule; rectangle support is partial — 5 of 11 valid samples on-prediction, not separable from a uniform-template null, though 0 of 11 reached the provably higher-scoring rival. Across three nominal tiers we find an inversion: constructive ambition rises monotonically with tier while execution validity rises then collapses (78% → 100% → 13% at the primary 10⁻⁶ tolerance; the top-tier arm ran through an unattributable serving alias, opus_alias, flagged throughout). Requesting a method-naming trace line concentrates output onto the anchor (87% vs 70% on-prediction, p = 0.03 uncorrected — failing Holm over the registered family, carried by one of three cells and confounded with a collection-wave split of comparable size) with no detectable validity change. Our contribution relative to a growing diversity-collapse literature is not that collapse occurs — it is the expected default — but that its mode is predictable in closed form </w:t>
+        <w:t xml:space="preserve"> — which template, and hence its computed value — at all seven tested N, stated before sampling. Per-sample agreement equals that modal frequency — 56–86% by cell — while a round-number baseline hits 2 of 69 valid samples. We preregistered these point predictions and tested them out of sample on two new containers (square and rectangle), restating but never refitting the rule; on the rectangle the informative result is negative — 0 of 11 valid samples reached the provably higher-scoring rival — while on-prediction support is partial (5 of 11, not separable from a uniform-template null). Across three nominal tiers we find an inversion: constructive ambition rises monotonically with tier while execution validity rises then collapses (78% → 100% → 13% at the primary 10⁻⁶ tolerance; the top-tier arm ran through an unattributable serving alias, opus_alias, flagged throughout). Requesting a method-naming trace line concentrates output onto the anchor (87% vs 70% on-prediction, p = 0.03 uncorrected — failing Holm over the registered family, carried by one of three cells and confounded with a collection-wave split of comparable size) with no detectable validity change. A preregistered extension run after external review sharpens the scope both ways: the branch rule's fifth k confirmed at N = 57 (modal T(8,57) = 3.5625000, 0/10 rival), while the filler branch's registered falsifier triggered 3/3 — at N = 20, 30, 41 the model moves to the (k</w:t>
       </w:r>
       <w:r>
         <w:rPr>
           <w:b w:val="0"/>
         </w:rPr>
-        <w:t>before* sampling.</w:t>
+        <w:t xml:space="preserve">+1) grid instead of extend-and-fill, so V(k, m) holds only on the m ≤ 1 support. Our contribution relative to a growing diversity-collapse literature is not that collapse occurs — it is the expected default — but that its mode is predictable in closed form </w:t>
+      </w:r>
+      <w:r>
+        <w:rPr>
+          <w:b w:val="0"/>
+          <w:i/>
+        </w:rPr>
+        <w:t>before</w:t>
+      </w:r>
+      <w:r>
+        <w:rPr>
+          <w:b w:val="0"/>
+        </w:rPr>
+        <w:t xml:space="preserve"> sampling.</w:t>
       </w:r>
     </w:p>
     <w:p>
@@ -210,20 +223,7 @@
         <w:rPr>
           <w:b w:val="0"/>
         </w:rPr>
-        <w:t xml:space="preserve"> (1) A closed form — k</w:t>
-      </w:r>
-      <w:r>
-        <w:rPr>
-          <w:b w:val="0"/>
-          <w:i/>
-        </w:rPr>
-        <w:t xml:space="preserve">(N), V(k, m), T(k, N) — naming the modal weak-tier output in advance, tested out of sample on a rectangle container whose rule was restated but never refitted. (2) A tier boundary: three attractor families, ambition rising monotonically while validity does not. (3) Trace elicitation as an </w:t>
-      </w:r>
-      <w:r>
-        <w:rPr>
-          <w:b w:val="0"/>
-        </w:rPr>
-        <w:t>intervention*: a method line perturbs the sampled distribution rather than merely observing it — reported with the fragility it carries, not as a demonstrated effect.</w:t>
+        <w:t xml:space="preserve"> (1) A closed form — k*(N), V(k, m), T(k, N) — naming the modal weak-tier output in advance, tested out of sample on a rectangle container whose rule was restated but never refitted. (2) A tier boundary: three attractor families, ambition rising monotonically while validity does not — with ambition measured, not asserted (§3). (3) Checkable faithfulness, and trace requests as interventions: 54 of 56 scoreable method-line claims (96.4%) describe the object actually built, while requesting the line at all perturbs the sampled distribution — the concentration shift is reported with the fragility it carries (§4), not as a demonstrated effect.</w:t>
       </w:r>
     </w:p>
     <w:p>
@@ -948,6 +948,62 @@
         <w:rPr>
           <w:b/>
         </w:rPr>
+        <w:t>Preregistered extension (arm M).</w:t>
+      </w:r>
+      <w:r>
+        <w:rPr>
+          <w:b w:val="0"/>
+        </w:rPr>
+        <w:t xml:space="preserve"> After external review flagged that the filler branch was supported only at m ∈ {0, 1} and that k = 8 was never sampled, we registered and ran four new cells (n = 15 each, hashes + tie-stated falsifiers committed before sampling). Outcome, both directions: </w:t>
+      </w:r>
+      <w:r>
+        <w:rPr>
+          <w:b/>
+        </w:rPr>
+        <w:t>P-M4 confirmed</w:t>
+      </w:r>
+      <w:r>
+        <w:rPr>
+          <w:b w:val="0"/>
+        </w:rPr>
+        <w:t xml:space="preserve"> — N = 57 modal output is T(8,57) = 3.5625000 (6/10 valid on prediction, 0/10 rival), the truncate arm's fifth confirmed k. </w:t>
+      </w:r>
+      <w:r>
+        <w:rPr>
+          <w:b/>
+        </w:rPr>
+        <w:t>Falsifier F-M1 triggered 3/3</w:t>
+      </w:r>
+      <w:r>
+        <w:rPr>
+          <w:b w:val="0"/>
+        </w:rPr>
+        <w:t xml:space="preserve"> — at N = 20/30/41 (m = 4, 5, 5) the modal outputs are T(5,20) = 2.0, T(6,30) = 2.5 and T(7,41) = 2.9285714: the model moves up to the (k</w:t>
+      </w:r>
+      <w:r>
+        <w:rPr>
+          <w:b w:val="0"/>
+          <w:i/>
+        </w:rPr>
+        <w:t>+1) grid and truncates or exactly fills it (20 = 5×4, 30 = 6×5) rather than extending with fillers — 1 of 36 valid converge samples emitted the registered V(k</w:t>
+      </w:r>
+      <w:r>
+        <w:rPr>
+          <w:b w:val="0"/>
+        </w:rPr>
+        <w:t>, m). V(k, m) is therefore restricted to the m ≤ 1 support, and the rectangle-factorization preference is further evidence for the untested arithmetic-tractability alternative (§5).</w:t>
+      </w:r>
+    </w:p>
+    <w:p>
+      <w:r>
+        <w:rPr>
+          <w:b w:val="0"/>
+        </w:rPr>
+      </w:r>
+      <w:r>
+        <w:rPr>
+          <w:b/>
+        </w:rPr>
         <w:t>Out-of-sample transfer.</w:t>
       </w:r>
       <w:r>
@@ -995,7 +1051,7 @@
         <w:rPr>
           <w:b w:val="0"/>
         </w:rPr>
-        <w:t>Holding prompt, container, and scoring fixed, we varied only the nominal proposer tier at the three hardest-discriminating cells (N = 13, 21, 31). The weak tier truncates uniform grids: 35 of 45 invocations valid at 10⁻⁶ (78%), 29 of 45 at 10⁻⁹ (64%). A middle tier (Sonnet-class) perturbs and mixes templates — enlarged edge rows, hexagonal interior rows, multi-radius packings — valid 30/30 at 10⁻⁶ (100%), 27/30 (90%) at 10⁻⁹, but almost never on-prediction. A third arm, addressed only through a bare serving alias with no attestable weights binding (opus_alias, flagged with that caveat throughout and never referred to as any specific dated model), attempts recursive gasket-style constructions and is valid in 4 of 30 invocations (13%) at both tolerances, failing mostly on geometric overlap rather than numerical error. A post-hoc diagnostic (not preregistered; labeled as such in the repository) finds no evidence of a tolerance artifact behind that 13% in this sample: 24 of 26 invalid samples overlap grossly (median maximum overlap 3.3×10⁻²; radius-shrink repair costs a median 15% of sum-of-radii), while tolerance-scale near-misses (&lt; 2.5×10⁻⁵) occur instead in 5 of 7 geometry-scored weak-tier failures — the exact-tangency grids, not the ambitious constructions. The ladder: 78% → 100% → 13% (64% → 90% → 13% at the stricter tolerance). "Monotone" applies to ambition only, while validity rises then collapses — a boundary condition on the main result: the branch rule is a weak-tier regularity, holding at the tier furthest from what discovery-loop proposers typically use.</w:t>
+        <w:t>Holding prompt, container, and scoring fixed, we varied only the nominal proposer tier at the three hardest-discriminating cells (N = 13, 21, 31). The weak tier truncates uniform grids: 35 of 45 invocations valid at 10⁻⁶ (78%), 29 of 45 at 10⁻⁹ (64%). A middle tier (Sonnet-class) perturbs and mixes templates — enlarged edge rows, hexagonal interior rows, multi-radius packings — valid 30/30 at 10⁻⁶ (100%), 27/30 (90%) at 10⁻⁹, but almost never on-prediction. A third arm, addressed only through a bare serving alias with no attestable weights binding (opus_alias, flagged with that caveat throughout and never referred to as any specific dated model), attempts recursive gasket-style constructions and is valid in 4 of 30 invocations (13%) at both tolerances, failing mostly on geometric overlap rather than numerical error. A post-hoc diagnostic (not preregistered; labeled as such in the repository) finds no evidence of a tolerance artifact behind that 13% in this sample: 24 of 26 invalid samples overlap grossly (median maximum overlap 3.3×10⁻²; radius-shrink repair costs a median 15% of sum-of-radii), while tolerance-scale near-misses (&lt; 2.5×10⁻⁵) occur instead in 5 of 7 geometry-scored weak-tier failures — the exact-tangency grids, not the ambitious constructions. The ladder: 78% → 100% → 13% (64% → 90% → 13% at the stricter tolerance). "Monotone" applies to ambition only, and ambition is measured rather than asserted: a disclosed post-hoc diagnostic (diagnostics_ambition.py, all samples with emitted geometry, invalid included) gives median distinct radii 1 → 2 → 3 and median off-lattice center fraction 0.08 → 0.43 → 0.95 across the tiers, monotone on both. Validity instead rises then collapses — a boundary condition on the main result: the branch rule is a weak-tier regularity, holding at the tier furthest from what discovery-loop proposers typically use.</w:t>
       </w:r>
     </w:p>
     <w:p>
@@ -1119,7 +1175,7 @@
         <w:rPr>
           <w:b w:val="0"/>
         </w:rPr>
-        <w:t xml:space="preserve">Collapse onto a narrow output mode under an unconditioned or weakly-conditioned LLM call is a known default, not a novel observation: "Artificial Hivemind" (2510.22954) documents the same homogeneity across open-ended domains at survey scale; "The Price of Format" (2505.18949) shows format constraints collapsing generation diversity; "Mutation Without Variation" (2606.05408) finds iterated LLM mutation loops collapsing onto previously seen templates; and "Measuring the Gap Between Human and LLM Research Ideas" (2607.01233) reports the same collapse one level up, in idea space. Our contribution is not that collapse occurs — it is the expected default — but that, here, the collapsed mode's value is predictable to seven decimals </w:t>
+        <w:t xml:space="preserve">Collapse onto a narrow output mode under an unconditioned or weakly-conditioned LLM call is a known default, not a novel observation: "Artificial Hivemind" (2510.22954) documents the same homogeneity across open-ended domains at survey scale; "The Price of Format" (2505.18949) shows format constraints collapsing generation diversity; "Mutation Without Variation" (2606.05408) finds iterated LLM mutation loops collapsing onto previously seen templates; and "Measuring the Gap Between Human and LLM Research Ideas" (2607.01233) reports the same collapse one level up, in idea space. Our contribution is not that collapse occurs — it is the expected default — but that, here, the collapsed mode is a single closed-form-computable object, stated </w:t>
       </w:r>
       <w:r>
         <w:rPr>

</xml_diff>